<commit_message>
Update feature guide doc with presets, risk heatmap, and steering pack export
</commit_message>
<xml_diff>
--- a/docs/Guidewire-Upgrade-Readiness-Assistant-Features.docx
+++ b/docs/Guidewire-Upgrade-Readiness-Assistant-Features.docx
@@ -24,7 +24,7 @@
           <w:color w:val="656D76"/>
           <w:sz w:val="26"/>
         </w:rPr>
-        <w:t>Feature Guide — AI-Assisted Upgrade Readiness, Vendor Mocks, Contract Tests &amp; Data Migration</w:t>
+        <w:t>Feature Guide — Readiness Scoring, Risk Heatmap, Vendor Mocks, Contract Tests &amp; Data Migration</w:t>
       </w:r>
     </w:p>
     <w:p/>
@@ -81,6 +81,17 @@
         <w:rPr>
           <w:b/>
         </w:rPr>
+        <w:t xml:space="preserve">What's new in this release: </w:t>
+      </w:r>
+      <w:r>
+        <w:t>one-click sample scenarios across every tool, a six-dimension risk heatmap, and a downloadable / printable steering pack for the readiness assessment.</w:t>
+      </w:r>
+    </w:p>
+    <w:p>
+      <w:r>
+        <w:rPr>
+          <w:b/>
+        </w:rPr>
         <w:t xml:space="preserve">AI configuration: </w:t>
       </w:r>
       <w:r>
@@ -127,7 +138,7 @@
         <w:spacing w:after="40"/>
       </w:pPr>
       <w:r>
-        <w:t>Upgrade Readiness Scoring — score upgrade risk and generate an AI go/no-go advisory.</w:t>
+        <w:t>Upgrade Readiness Scoring — score upgrade risk, view a risk heatmap, and generate an AI go/no-go advisory you can export as a steering pack.</w:t>
       </w:r>
     </w:p>
     <w:p>
@@ -136,7 +147,7 @@
         <w:spacing w:after="40"/>
       </w:pPr>
       <w:r>
-        <w:t>Vendor Mocks &amp; Contract Tests — simulate vendor endpoints and validate integration payloads.</w:t>
+        <w:t>Vendor Mocks &amp; Contract Tests — simulate vendor endpoints and validate integration payloads against agreed contracts.</w:t>
       </w:r>
     </w:p>
     <w:p>
@@ -146,6 +157,14 @@
       </w:pPr>
       <w:r>
         <w:t>Data Migration Assist — validate source-to-target records and generate an AI remediation plan.</w:t>
+      </w:r>
+    </w:p>
+    <w:p>
+      <w:pPr>
+        <w:spacing w:after="120"/>
+      </w:pPr>
+      <w:r>
+        <w:t>Each tool ships one-click sample scenarios so it is self-demonstrating without any data entry.</w:t>
       </w:r>
     </w:p>
     <w:p>
@@ -226,13 +245,33 @@
       </w:r>
     </w:p>
     <w:p>
+      <w:r>
+        <w:rPr>
+          <w:b/>
+        </w:rPr>
+        <w:t>Sample scenarios.</w:t>
+      </w:r>
+      <w:r>
+        <w:rPr>
+          <w:b/>
+          <w:color w:val="FFFFFF"/>
+          <w:sz w:val="16"/>
+          <w:shd w:val="clear" w:fill="8250DF"/>
+        </w:rPr>
+        <w:t xml:space="preserve">  NEW  </w:t>
+      </w:r>
+      <w:r>
+        <w:t xml:space="preserve"> The 'Load a sample scenario' chips populate the entire form with one click — Cloud-ready (low risk), Typical programme (medium), or Heavy customisation (high risk) — so you can demonstrate the tool instantly. The screenshot below shows the Heavy customisation scenario loaded.</w:t>
+      </w:r>
+    </w:p>
+    <w:p>
       <w:pPr>
         <w:jc w:val="center"/>
       </w:pPr>
       <w:r>
         <w:drawing>
           <wp:inline xmlns:a="http://schemas.openxmlformats.org/drawingml/2006/main" xmlns:pic="http://schemas.openxmlformats.org/drawingml/2006/picture">
-            <wp:extent cx="5486400" cy="2705986"/>
+            <wp:extent cx="5486400" cy="3285460"/>
             <wp:docPr id="3" name="Picture 3"/>
             <wp:cNvGraphicFramePr>
               <a:graphicFrameLocks noChangeAspect="1"/>
@@ -241,7 +280,7 @@
               <a:graphicData uri="http://schemas.openxmlformats.org/drawingml/2006/picture">
                 <pic:pic>
                   <pic:nvPicPr>
-                    <pic:cNvPr id="0" name="readiness_inputs.png"/>
+                    <pic:cNvPr id="0" name="readiness_presets.png"/>
                     <pic:cNvPicPr/>
                   </pic:nvPicPr>
                   <pic:blipFill>
@@ -253,7 +292,7 @@
                   <pic:spPr>
                     <a:xfrm>
                       <a:off x="0" y="0"/>
-                      <a:ext cx="5486400" cy="2705986"/>
+                      <a:ext cx="5486400" cy="3285460"/>
                     </a:xfrm>
                     <a:prstGeom prst="rect"/>
                   </pic:spPr>
@@ -275,7 +314,7 @@
           <w:color w:val="656D76"/>
           <w:sz w:val="18"/>
         </w:rPr>
-        <w:t>Figure: Editable programme inputs and integration inventory.</w:t>
+        <w:t>Figure: Editable programme inputs with one-click sample-scenario chips (Heavy customisation loaded).</w:t>
       </w:r>
     </w:p>
     <w:p>
@@ -340,11 +379,23 @@
       </w:r>
     </w:p>
     <w:p>
-      <w:pPr>
-        <w:spacing w:after="120"/>
-      </w:pPr>
       <w:r>
-        <w:t>Claude then turns that evidence into a steering advisory: an executive summary, a GO / CONDITIONAL GO / NO-GO recommendation with a confidence level, a key-risks table with business impact, a prioritised remediation backlog (P0–P3), and a suggested upgrade sprint plan. A badge indicates whether the advisory was generated by Claude or by the deterministic fallback.</w:t>
+        <w:rPr>
+          <w:b/>
+        </w:rPr>
+        <w:t>Risk heatmap.</w:t>
+      </w:r>
+      <w:r>
+        <w:rPr>
+          <w:b/>
+          <w:color w:val="FFFFFF"/>
+          <w:sz w:val="16"/>
+          <w:shd w:val="clear" w:fill="8250DF"/>
+        </w:rPr>
+        <w:t xml:space="preserve">  NEW  </w:t>
+      </w:r>
+      <w:r>
+        <w:t xml:space="preserve"> The assessment now renders a colour-coded heatmap across the six upgrade dimensions — custom code, data, integration, testing, security, and environments. Custom code, data, integration, and testing are derived directly from the inputs; security and environments are lightweight heuristic estimates in this prototype and are flagged accordingly. Higher health scores mean lower risk.</w:t>
       </w:r>
     </w:p>
     <w:p>
@@ -354,7 +405,7 @@
       <w:r>
         <w:drawing>
           <wp:inline xmlns:a="http://schemas.openxmlformats.org/drawingml/2006/main" xmlns:pic="http://schemas.openxmlformats.org/drawingml/2006/picture">
-            <wp:extent cx="5212080" cy="6176719"/>
+            <wp:extent cx="5852160" cy="1400662"/>
             <wp:docPr id="5" name="Picture 5"/>
             <wp:cNvGraphicFramePr>
               <a:graphicFrameLocks noChangeAspect="1"/>
@@ -363,7 +414,7 @@
               <a:graphicData uri="http://schemas.openxmlformats.org/drawingml/2006/picture">
                 <pic:pic>
                   <pic:nvPicPr>
-                    <pic:cNvPr id="0" name="readiness_advisory.png"/>
+                    <pic:cNvPr id="0" name="readiness_heatmap.png"/>
                     <pic:cNvPicPr/>
                   </pic:nvPicPr>
                   <pic:blipFill>
@@ -375,7 +426,7 @@
                   <pic:spPr>
                     <a:xfrm>
                       <a:off x="0" y="0"/>
-                      <a:ext cx="5212080" cy="6176719"/>
+                      <a:ext cx="5852160" cy="1400662"/>
                     </a:xfrm>
                     <a:prstGeom prst="rect"/>
                   </pic:spPr>
@@ -397,7 +448,88 @@
           <w:color w:val="656D76"/>
           <w:sz w:val="18"/>
         </w:rPr>
-        <w:t>Figure: AI upgrade advisory: go/no-go, key risks, remediation backlog, and sprint plan (deterministic fallback shown).</w:t>
+        <w:t>Figure: Six-dimension risk heatmap; 'heuristic' dimensions are estimated from available inputs.</w:t>
+      </w:r>
+    </w:p>
+    <w:p>
+      <w:pPr>
+        <w:spacing w:after="120"/>
+      </w:pPr>
+      <w:r>
+        <w:t>Claude then turns that evidence into a steering advisory: an executive summary, a GO / CONDITIONAL GO / NO-GO recommendation with a confidence level, a key-risks table with business impact, a prioritised remediation backlog (P0–P3), and a suggested upgrade sprint plan.</w:t>
+      </w:r>
+    </w:p>
+    <w:p>
+      <w:r>
+        <w:rPr>
+          <w:b/>
+        </w:rPr>
+        <w:t>Steering pack export.</w:t>
+      </w:r>
+      <w:r>
+        <w:rPr>
+          <w:b/>
+          <w:color w:val="FFFFFF"/>
+          <w:sz w:val="16"/>
+          <w:shd w:val="clear" w:fill="8250DF"/>
+        </w:rPr>
+        <w:t xml:space="preserve">  NEW  </w:t>
+      </w:r>
+      <w:r>
+        <w:t xml:space="preserve"> From the advisory you can download a Markdown steering pack (score, heatmap, key risks, findings, backlog, and sprint plan) or use Print / Save as PDF — a print stylesheet hides the inputs and page chrome so only the results are printed. The export buttons appear at the bottom of the advisory card.</w:t>
+      </w:r>
+    </w:p>
+    <w:p>
+      <w:pPr>
+        <w:jc w:val="center"/>
+      </w:pPr>
+      <w:r>
+        <w:drawing>
+          <wp:inline xmlns:a="http://schemas.openxmlformats.org/drawingml/2006/main" xmlns:pic="http://schemas.openxmlformats.org/drawingml/2006/picture">
+            <wp:extent cx="4937760" cy="6090861"/>
+            <wp:docPr id="6" name="Picture 6"/>
+            <wp:cNvGraphicFramePr>
+              <a:graphicFrameLocks noChangeAspect="1"/>
+            </wp:cNvGraphicFramePr>
+            <a:graphic>
+              <a:graphicData uri="http://schemas.openxmlformats.org/drawingml/2006/picture">
+                <pic:pic>
+                  <pic:nvPicPr>
+                    <pic:cNvPr id="0" name="readiness_advisory.png"/>
+                    <pic:cNvPicPr/>
+                  </pic:nvPicPr>
+                  <pic:blipFill>
+                    <a:blip r:embed="rId14"/>
+                    <a:stretch>
+                      <a:fillRect/>
+                    </a:stretch>
+                  </pic:blipFill>
+                  <pic:spPr>
+                    <a:xfrm>
+                      <a:off x="0" y="0"/>
+                      <a:ext cx="4937760" cy="6090861"/>
+                    </a:xfrm>
+                    <a:prstGeom prst="rect"/>
+                  </pic:spPr>
+                </pic:pic>
+              </a:graphicData>
+            </a:graphic>
+          </wp:inline>
+        </w:drawing>
+      </w:r>
+    </w:p>
+    <w:p>
+      <w:pPr>
+        <w:spacing w:after="240"/>
+        <w:jc w:val="center"/>
+      </w:pPr>
+      <w:r>
+        <w:rPr>
+          <w:i/>
+          <w:color w:val="656D76"/>
+          <w:sz w:val="18"/>
+        </w:rPr>
+        <w:t>Figure: AI upgrade advisory with go/no-go, key risks, remediation backlog, sprint plan, and export buttons (deterministic fallback shown).</w:t>
       </w:r>
     </w:p>
     <w:p>
@@ -432,7 +564,7 @@
         <w:drawing>
           <wp:inline xmlns:a="http://schemas.openxmlformats.org/drawingml/2006/main" xmlns:pic="http://schemas.openxmlformats.org/drawingml/2006/picture">
             <wp:extent cx="5486400" cy="3482163"/>
-            <wp:docPr id="6" name="Picture 6"/>
+            <wp:docPr id="7" name="Picture 7"/>
             <wp:cNvGraphicFramePr>
               <a:graphicFrameLocks noChangeAspect="1"/>
             </wp:cNvGraphicFramePr>
@@ -444,7 +576,7 @@
                     <pic:cNvPicPr/>
                   </pic:nvPicPr>
                   <pic:blipFill>
-                    <a:blip r:embed="rId14"/>
+                    <a:blip r:embed="rId15"/>
                     <a:stretch>
                       <a:fillRect/>
                     </a:stretch>
@@ -478,11 +610,26 @@
       </w:r>
     </w:p>
     <w:p>
-      <w:pPr>
-        <w:spacing w:after="120"/>
-      </w:pPr>
       <w:r>
-        <w:t>The contract test validates an outbound integration payload against an agreed JSON Schema contract (fraudRequest, paymentRequest, documentRequest) using AJV. Editing the payload to introduce a violation and re-running surfaces a PASS/FAIL result and a table of schema errors with their path and message — the same checks that gate integrations before upgrade system testing.</w:t>
+        <w:t xml:space="preserve">The contract test validates an outbound integration payload against an agreed JSON Schema contract (fraudRequest, paymentRequest, documentRequest) using AJV. </w:t>
+      </w:r>
+      <w:r>
+        <w:rPr>
+          <w:b/>
+        </w:rPr>
+        <w:t>Valid example and Invalid example buttons</w:t>
+      </w:r>
+      <w:r>
+        <w:rPr>
+          <w:b/>
+          <w:color w:val="FFFFFF"/>
+          <w:sz w:val="16"/>
+          <w:shd w:val="clear" w:fill="8250DF"/>
+        </w:rPr>
+        <w:t xml:space="preserve">  NEW  </w:t>
+      </w:r>
+      <w:r>
+        <w:t xml:space="preserve"> load ready-made payloads so you can show a pass and a failure without typing. The example below loads the invalid fraudRequest payload, producing a FAIL with a table of schema errors (path and message) — the same checks that gate integrations before upgrade system testing.</w:t>
       </w:r>
     </w:p>
     <w:p>
@@ -492,8 +639,8 @@
       <w:r>
         <w:drawing>
           <wp:inline xmlns:a="http://schemas.openxmlformats.org/drawingml/2006/main" xmlns:pic="http://schemas.openxmlformats.org/drawingml/2006/picture">
-            <wp:extent cx="4937760" cy="5100438"/>
-            <wp:docPr id="7" name="Picture 7"/>
+            <wp:extent cx="4846320" cy="5231396"/>
+            <wp:docPr id="8" name="Picture 8"/>
             <wp:cNvGraphicFramePr>
               <a:graphicFrameLocks noChangeAspect="1"/>
             </wp:cNvGraphicFramePr>
@@ -505,7 +652,7 @@
                     <pic:cNvPicPr/>
                   </pic:nvPicPr>
                   <pic:blipFill>
-                    <a:blip r:embed="rId15"/>
+                    <a:blip r:embed="rId16"/>
                     <a:stretch>
                       <a:fillRect/>
                     </a:stretch>
@@ -513,7 +660,7 @@
                   <pic:spPr>
                     <a:xfrm>
                       <a:off x="0" y="0"/>
-                      <a:ext cx="4937760" cy="5100438"/>
+                      <a:ext cx="4846320" cy="5231396"/>
                     </a:xfrm>
                     <a:prstGeom prst="rect"/>
                   </pic:spPr>
@@ -535,7 +682,7 @@
           <w:color w:val="656D76"/>
           <w:sz w:val="18"/>
         </w:rPr>
-        <w:t>Figure: Contract test showing a FAIL result with the schema validation errors table.</w:t>
+        <w:t>Figure: Contract test with the Invalid example loaded, showing a FAIL result and the schema validation errors table.</w:t>
       </w:r>
     </w:p>
     <w:p>
@@ -563,14 +710,34 @@
       </w:r>
     </w:p>
     <w:p>
+      <w:r>
+        <w:rPr>
+          <w:b/>
+        </w:rPr>
+        <w:t>Sample datasets.</w:t>
+      </w:r>
+      <w:r>
+        <w:rPr>
+          <w:b/>
+          <w:color w:val="FFFFFF"/>
+          <w:sz w:val="16"/>
+          <w:shd w:val="clear" w:fill="8250DF"/>
+        </w:rPr>
+        <w:t xml:space="preserve">  NEW  </w:t>
+      </w:r>
+      <w:r>
+        <w:t xml:space="preserve"> The dataset chips load a Clean dataset, Common defects, or Critical blockers set with one click. The screenshot shows the Critical blockers dataset loaded.</w:t>
+      </w:r>
+    </w:p>
+    <w:p>
       <w:pPr>
         <w:jc w:val="center"/>
       </w:pPr>
       <w:r>
         <w:drawing>
           <wp:inline xmlns:a="http://schemas.openxmlformats.org/drawingml/2006/main" xmlns:pic="http://schemas.openxmlformats.org/drawingml/2006/picture">
-            <wp:extent cx="5486400" cy="2567763"/>
-            <wp:docPr id="8" name="Picture 8"/>
+            <wp:extent cx="5486400" cy="2929270"/>
+            <wp:docPr id="9" name="Picture 9"/>
             <wp:cNvGraphicFramePr>
               <a:graphicFrameLocks noChangeAspect="1"/>
             </wp:cNvGraphicFramePr>
@@ -578,11 +745,11 @@
               <a:graphicData uri="http://schemas.openxmlformats.org/drawingml/2006/picture">
                 <pic:pic>
                   <pic:nvPicPr>
-                    <pic:cNvPr id="0" name="migration_input.png"/>
+                    <pic:cNvPr id="0" name="migration_presets.png"/>
                     <pic:cNvPicPr/>
                   </pic:nvPicPr>
                   <pic:blipFill>
-                    <a:blip r:embed="rId16"/>
+                    <a:blip r:embed="rId17"/>
                     <a:stretch>
                       <a:fillRect/>
                     </a:stretch>
@@ -590,7 +757,7 @@
                   <pic:spPr>
                     <a:xfrm>
                       <a:off x="0" y="0"/>
-                      <a:ext cx="5486400" cy="2567763"/>
+                      <a:ext cx="5486400" cy="2929270"/>
                     </a:xfrm>
                     <a:prstGeom prst="rect"/>
                   </pic:spPr>
@@ -612,7 +779,7 @@
           <w:color w:val="656D76"/>
           <w:sz w:val="18"/>
         </w:rPr>
-        <w:t>Figure: Editable candidate migration records.</w:t>
+        <w:t>Figure: Editable candidate migration records with one-click sample-dataset chips (Critical blockers loaded).</w:t>
       </w:r>
     </w:p>
     <w:p>
@@ -630,8 +797,8 @@
       <w:r>
         <w:drawing>
           <wp:inline xmlns:a="http://schemas.openxmlformats.org/drawingml/2006/main" xmlns:pic="http://schemas.openxmlformats.org/drawingml/2006/picture">
-            <wp:extent cx="5486400" cy="2270051"/>
-            <wp:docPr id="9" name="Picture 9"/>
+            <wp:extent cx="5486400" cy="2567763"/>
+            <wp:docPr id="10" name="Picture 10"/>
             <wp:cNvGraphicFramePr>
               <a:graphicFrameLocks noChangeAspect="1"/>
             </wp:cNvGraphicFramePr>
@@ -643,7 +810,7 @@
                     <pic:cNvPicPr/>
                   </pic:nvPicPr>
                   <pic:blipFill>
-                    <a:blip r:embed="rId17"/>
+                    <a:blip r:embed="rId18"/>
                     <a:stretch>
                       <a:fillRect/>
                     </a:stretch>
@@ -651,7 +818,7 @@
                   <pic:spPr>
                     <a:xfrm>
                       <a:off x="0" y="0"/>
-                      <a:ext cx="5486400" cy="2270051"/>
+                      <a:ext cx="5486400" cy="2567763"/>
                     </a:xfrm>
                     <a:prstGeom prst="rect"/>
                   </pic:spPr>
@@ -691,8 +858,8 @@
       <w:r>
         <w:drawing>
           <wp:inline xmlns:a="http://schemas.openxmlformats.org/drawingml/2006/main" xmlns:pic="http://schemas.openxmlformats.org/drawingml/2006/picture">
-            <wp:extent cx="5486400" cy="3641651"/>
-            <wp:docPr id="10" name="Picture 10"/>
+            <wp:extent cx="5486400" cy="3848986"/>
+            <wp:docPr id="11" name="Picture 11"/>
             <wp:cNvGraphicFramePr>
               <a:graphicFrameLocks noChangeAspect="1"/>
             </wp:cNvGraphicFramePr>
@@ -704,7 +871,7 @@
                     <pic:cNvPicPr/>
                   </pic:nvPicPr>
                   <pic:blipFill>
-                    <a:blip r:embed="rId18"/>
+                    <a:blip r:embed="rId19"/>
                     <a:stretch>
                       <a:fillRect/>
                     </a:stretch>
@@ -712,7 +879,7 @@
                   <pic:spPr>
                     <a:xfrm>
                       <a:off x="0" y="0"/>
-                      <a:ext cx="5486400" cy="3641651"/>
+                      <a:ext cx="5486400" cy="3848986"/>
                     </a:xfrm>
                     <a:prstGeom prst="rect"/>
                   </pic:spPr>
@@ -758,7 +925,7 @@
         <w:spacing w:after="120"/>
       </w:pPr>
       <w:r>
-        <w:t>Architecture and key endpoints:</w:t>
+        <w:t>Architecture and key modules:</w:t>
       </w:r>
     </w:p>
     <w:p>
@@ -777,6 +944,33 @@
       </w:pPr>
       <w:r>
         <w:t>Rule engine: lib/readiness.ts, lib/contracts.ts (AJV), lib/migration.ts, lib/mockVendors.ts.</w:t>
+      </w:r>
+    </w:p>
+    <w:p>
+      <w:pPr>
+        <w:pStyle w:val="ListBullet"/>
+        <w:spacing w:after="40"/>
+      </w:pPr>
+      <w:r>
+        <w:t>Risk heatmap: lib/heatmap.ts — six-dimension health/risk model surfaced via the advisory endpoint.</w:t>
+      </w:r>
+    </w:p>
+    <w:p>
+      <w:pPr>
+        <w:pStyle w:val="ListBullet"/>
+        <w:spacing w:after="40"/>
+      </w:pPr>
+      <w:r>
+        <w:t>Sample scenarios: lib/samples.ts — readiness profiles, migration datasets, and contract example payloads.</w:t>
+      </w:r>
+    </w:p>
+    <w:p>
+      <w:pPr>
+        <w:pStyle w:val="ListBullet"/>
+        <w:spacing w:after="40"/>
+      </w:pPr>
+      <w:r>
+        <w:t>Steering pack: lib/report.ts — Markdown report builder, with a print stylesheet for Save as PDF.</w:t>
       </w:r>
     </w:p>
     <w:p>
@@ -870,14 +1064,10 @@
         <w:spacing w:after="40"/>
       </w:pPr>
       <w:r>
-        <w:t>UI: GitHub Primer-inspired design system (globals.css) with a shared header/footer, cards, labels, and tables.</w:t>
+        <w:t>UI: GitHub Primer-inspired design system (globals.css) with a shared header/footer, cards, labels, heatmap grid, and tables.</w:t>
       </w:r>
     </w:p>
-    <w:p>
-      <w:pPr>
-        <w:spacing w:after="120"/>
-      </w:pPr>
-    </w:p>
+    <w:p/>
     <w:p>
       <w:r>
         <w:t xml:space="preserve">To enable the live AI features, set </w:t>

</xml_diff>

<commit_message>
Add ROI business case: standalone one-pager and feature-guide ROI section
</commit_message>
<xml_diff>
--- a/docs/Guidewire-Upgrade-Readiness-Assistant-Features.docx
+++ b/docs/Guidewire-Upgrade-Readiness-Assistant-Features.docx
@@ -910,6 +910,1661 @@
       </w:r>
     </w:p>
     <w:p>
+      <w:r>
+        <w:br w:type="page"/>
+      </w:r>
+    </w:p>
+    <w:p>
+      <w:pPr>
+        <w:pStyle w:val="Heading1"/>
+      </w:pPr>
+      <w:r>
+        <w:rPr>
+          <w:color w:val="0969DA"/>
+        </w:rPr>
+        <w:t>Return on Investment</w:t>
+      </w:r>
+    </w:p>
+    <w:p>
+      <w:pPr>
+        <w:spacing w:after="120"/>
+      </w:pPr>
+      <w:r>
+        <w:t>The accelerators reduce upgrade cost and risk by assessing risk earlier, shifting integration and data defects left, and cutting rework and dry-run cycles. Base case: ~218% year-1 ROI and ~4-month payback, rising on every subsequent upgrade because the accelerators are reusable.</w:t>
+      </w:r>
+    </w:p>
+    <w:p>
+      <w:pPr>
+        <w:pStyle w:val="Heading2"/>
+      </w:pPr>
+      <w:r>
+        <w:rPr>
+          <w:color w:val="1F2328"/>
+        </w:rPr>
+        <w:t>How the ROI is calculated</w:t>
+      </w:r>
+    </w:p>
+    <w:p>
+      <w:pPr>
+        <w:spacing w:after="120"/>
+      </w:pPr>
+      <w:r>
+        <w:t>ROI % = (Gross benefit − Investment) / Investment × 100.   Payback = Investment / monthly net benefit.   Risk avoided = Δ(probability of bad outcome) × cost of that outcome.</w:t>
+      </w:r>
+    </w:p>
+    <w:p>
+      <w:pPr>
+        <w:pStyle w:val="ListNumber"/>
+        <w:spacing w:after="40"/>
+      </w:pPr>
+      <w:r>
+        <w:t>Baseline the as-is (effort, defect leakage, overrun %, dry-run counts) from prior upgrades or benchmarks.</w:t>
+      </w:r>
+    </w:p>
+    <w:p>
+      <w:pPr>
+        <w:pStyle w:val="ListNumber"/>
+        <w:spacing w:after="40"/>
+      </w:pPr>
+      <w:r>
+        <w:t>Name the value levers the accelerator pulls (effort saved, defects shifted left, risk reduced, time-to-value).</w:t>
+      </w:r>
+    </w:p>
+    <w:p>
+      <w:pPr>
+        <w:pStyle w:val="ListNumber"/>
+        <w:spacing w:after="40"/>
+      </w:pPr>
+      <w:r>
+        <w:t>Quantify with conservative / base / optimistic cases and a sensitivity check on the key drivers.</w:t>
+      </w:r>
+    </w:p>
+    <w:p>
+      <w:pPr>
+        <w:pStyle w:val="ListNumber"/>
+        <w:spacing w:after="40"/>
+      </w:pPr>
+      <w:r>
+        <w:t>Track leading indicators after deployment to convert projected ROI into realised ROI.</w:t>
+      </w:r>
+    </w:p>
+    <w:p>
+      <w:pPr>
+        <w:pStyle w:val="Heading2"/>
+      </w:pPr>
+      <w:r>
+        <w:rPr>
+          <w:color w:val="1F2328"/>
+        </w:rPr>
+        <w:t>Value levers and quantified benefits</w:t>
+      </w:r>
+    </w:p>
+    <w:p>
+      <w:r>
+        <w:rPr>
+          <w:b/>
+          <w:color w:val="1F2328"/>
+          <w:sz w:val="23"/>
+        </w:rPr>
+        <w:t>1. Upgrade Readiness Scoring</w:t>
+      </w:r>
+    </w:p>
+    <w:tbl>
+      <w:tblPr>
+        <w:tblW w:type="auto" w:w="0"/>
+        <w:tblLook w:firstColumn="1" w:firstRow="1" w:lastColumn="0" w:lastRow="0" w:noHBand="0" w:noVBand="1" w:val="04A0"/>
+        <w:tblBorders>
+          <w:top w:val="single" w:sz="4" w:color="D0D7DE"/>
+          <w:left w:val="single" w:sz="4" w:color="D0D7DE"/>
+          <w:bottom w:val="single" w:sz="4" w:color="D0D7DE"/>
+          <w:right w:val="single" w:sz="4" w:color="D0D7DE"/>
+          <w:insideH w:val="single" w:sz="4" w:color="D0D7DE"/>
+          <w:insideV w:val="single" w:sz="4" w:color="D0D7DE"/>
+        </w:tblBorders>
+      </w:tblPr>
+      <w:tblGrid>
+        <w:gridCol w:w="2880"/>
+        <w:gridCol w:w="2880"/>
+        <w:gridCol w:w="2880"/>
+      </w:tblGrid>
+      <w:tr>
+        <w:tc>
+          <w:tcPr>
+            <w:tcW w:type="dxa" w:w="2736"/>
+            <w:shd w:val="clear" w:fill="1F2328"/>
+          </w:tcPr>
+          <w:p>
+            <w:r/>
+            <w:r>
+              <w:rPr>
+                <w:b/>
+                <w:color w:val="FFFFFF"/>
+                <w:sz w:val="19"/>
+              </w:rPr>
+              <w:t>Value lever</w:t>
+            </w:r>
+          </w:p>
+        </w:tc>
+        <w:tc>
+          <w:tcPr>
+            <w:tcW w:type="dxa" w:w="4464"/>
+            <w:shd w:val="clear" w:fill="1F2328"/>
+          </w:tcPr>
+          <w:p>
+            <w:r/>
+            <w:r>
+              <w:rPr>
+                <w:b/>
+                <w:color w:val="FFFFFF"/>
+                <w:sz w:val="19"/>
+              </w:rPr>
+              <w:t>Basis</w:t>
+            </w:r>
+          </w:p>
+        </w:tc>
+        <w:tc>
+          <w:tcPr>
+            <w:tcW w:type="dxa" w:w="1584"/>
+            <w:shd w:val="clear" w:fill="1F2328"/>
+          </w:tcPr>
+          <w:p>
+            <w:r/>
+            <w:r>
+              <w:rPr>
+                <w:b/>
+                <w:color w:val="FFFFFF"/>
+                <w:sz w:val="19"/>
+              </w:rPr>
+              <w:t>Illustrative</w:t>
+            </w:r>
+          </w:p>
+        </w:tc>
+      </w:tr>
+      <w:tr>
+        <w:tc>
+          <w:tcPr>
+            <w:tcW w:type="dxa" w:w="2736"/>
+          </w:tcPr>
+          <w:p>
+            <w:r/>
+            <w:r>
+              <w:rPr>
+                <w:b w:val="0"/>
+                <w:sz w:val="19"/>
+              </w:rPr>
+              <w:t>Faster assessment</w:t>
+            </w:r>
+          </w:p>
+        </w:tc>
+        <w:tc>
+          <w:tcPr>
+            <w:tcW w:type="dxa" w:w="4464"/>
+          </w:tcPr>
+          <w:p>
+            <w:r/>
+            <w:r>
+              <w:rPr>
+                <w:b w:val="0"/>
+                <w:sz w:val="19"/>
+              </w:rPr>
+              <w:t>Replaces architect workshops (45 → 9 person-days)</w:t>
+            </w:r>
+          </w:p>
+        </w:tc>
+        <w:tc>
+          <w:tcPr>
+            <w:tcW w:type="dxa" w:w="1584"/>
+          </w:tcPr>
+          <w:p>
+            <w:r/>
+            <w:r>
+              <w:rPr>
+                <w:b w:val="0"/>
+                <w:sz w:val="19"/>
+              </w:rPr>
+              <w:t>~£25k</w:t>
+            </w:r>
+          </w:p>
+        </w:tc>
+      </w:tr>
+      <w:tr>
+        <w:tc>
+          <w:tcPr>
+            <w:tcW w:type="dxa" w:w="2736"/>
+          </w:tcPr>
+          <w:p>
+            <w:r/>
+            <w:r>
+              <w:rPr>
+                <w:b w:val="0"/>
+                <w:sz w:val="19"/>
+              </w:rPr>
+              <w:t>Fewer wasted sprints</w:t>
+            </w:r>
+          </w:p>
+        </w:tc>
+        <w:tc>
+          <w:tcPr>
+            <w:tcW w:type="dxa" w:w="4464"/>
+          </w:tcPr>
+          <w:p>
+            <w:r/>
+            <w:r>
+              <w:rPr>
+                <w:b w:val="0"/>
+                <w:sz w:val="19"/>
+              </w:rPr>
+              <w:t>Better sequencing avoids a misdirected sprint</w:t>
+            </w:r>
+          </w:p>
+        </w:tc>
+        <w:tc>
+          <w:tcPr>
+            <w:tcW w:type="dxa" w:w="1584"/>
+          </w:tcPr>
+          <w:p>
+            <w:r/>
+            <w:r>
+              <w:rPr>
+                <w:b w:val="0"/>
+                <w:sz w:val="19"/>
+              </w:rPr>
+              <w:t>~£40k</w:t>
+            </w:r>
+          </w:p>
+        </w:tc>
+      </w:tr>
+      <w:tr>
+        <w:tc>
+          <w:tcPr>
+            <w:tcW w:type="dxa" w:w="2736"/>
+          </w:tcPr>
+          <w:p>
+            <w:r/>
+            <w:r>
+              <w:rPr>
+                <w:b w:val="0"/>
+                <w:sz w:val="19"/>
+              </w:rPr>
+              <w:t>Overrun avoidance</w:t>
+            </w:r>
+          </w:p>
+        </w:tc>
+        <w:tc>
+          <w:tcPr>
+            <w:tcW w:type="dxa" w:w="4464"/>
+          </w:tcPr>
+          <w:p>
+            <w:r/>
+            <w:r>
+              <w:rPr>
+                <w:b w:val="0"/>
+                <w:sz w:val="19"/>
+              </w:rPr>
+              <w:t>Halves overrun probability (0.5 × 20% × £300k)</w:t>
+            </w:r>
+          </w:p>
+        </w:tc>
+        <w:tc>
+          <w:tcPr>
+            <w:tcW w:type="dxa" w:w="1584"/>
+          </w:tcPr>
+          <w:p>
+            <w:r/>
+            <w:r>
+              <w:rPr>
+                <w:b w:val="0"/>
+                <w:sz w:val="19"/>
+              </w:rPr>
+              <w:t>~£30k</w:t>
+            </w:r>
+          </w:p>
+        </w:tc>
+      </w:tr>
+    </w:tbl>
+    <w:p/>
+    <w:p>
+      <w:r>
+        <w:rPr>
+          <w:b/>
+          <w:color w:val="1F2328"/>
+          <w:sz w:val="23"/>
+        </w:rPr>
+        <w:t>2. Vendor Mocks &amp; Contract Tests</w:t>
+      </w:r>
+    </w:p>
+    <w:tbl>
+      <w:tblPr>
+        <w:tblW w:type="auto" w:w="0"/>
+        <w:tblLook w:firstColumn="1" w:firstRow="1" w:lastColumn="0" w:lastRow="0" w:noHBand="0" w:noVBand="1" w:val="04A0"/>
+        <w:tblBorders>
+          <w:top w:val="single" w:sz="4" w:color="D0D7DE"/>
+          <w:left w:val="single" w:sz="4" w:color="D0D7DE"/>
+          <w:bottom w:val="single" w:sz="4" w:color="D0D7DE"/>
+          <w:right w:val="single" w:sz="4" w:color="D0D7DE"/>
+          <w:insideH w:val="single" w:sz="4" w:color="D0D7DE"/>
+          <w:insideV w:val="single" w:sz="4" w:color="D0D7DE"/>
+        </w:tblBorders>
+      </w:tblPr>
+      <w:tblGrid>
+        <w:gridCol w:w="2880"/>
+        <w:gridCol w:w="2880"/>
+        <w:gridCol w:w="2880"/>
+      </w:tblGrid>
+      <w:tr>
+        <w:tc>
+          <w:tcPr>
+            <w:tcW w:type="dxa" w:w="2736"/>
+            <w:shd w:val="clear" w:fill="1F2328"/>
+          </w:tcPr>
+          <w:p>
+            <w:r/>
+            <w:r>
+              <w:rPr>
+                <w:b/>
+                <w:color w:val="FFFFFF"/>
+                <w:sz w:val="19"/>
+              </w:rPr>
+              <w:t>Value lever</w:t>
+            </w:r>
+          </w:p>
+        </w:tc>
+        <w:tc>
+          <w:tcPr>
+            <w:tcW w:type="dxa" w:w="4464"/>
+            <w:shd w:val="clear" w:fill="1F2328"/>
+          </w:tcPr>
+          <w:p>
+            <w:r/>
+            <w:r>
+              <w:rPr>
+                <w:b/>
+                <w:color w:val="FFFFFF"/>
+                <w:sz w:val="19"/>
+              </w:rPr>
+              <w:t>Basis</w:t>
+            </w:r>
+          </w:p>
+        </w:tc>
+        <w:tc>
+          <w:tcPr>
+            <w:tcW w:type="dxa" w:w="1584"/>
+            <w:shd w:val="clear" w:fill="1F2328"/>
+          </w:tcPr>
+          <w:p>
+            <w:r/>
+            <w:r>
+              <w:rPr>
+                <w:b/>
+                <w:color w:val="FFFFFF"/>
+                <w:sz w:val="19"/>
+              </w:rPr>
+              <w:t>Illustrative</w:t>
+            </w:r>
+          </w:p>
+        </w:tc>
+      </w:tr>
+      <w:tr>
+        <w:tc>
+          <w:tcPr>
+            <w:tcW w:type="dxa" w:w="2736"/>
+          </w:tcPr>
+          <w:p>
+            <w:r/>
+            <w:r>
+              <w:rPr>
+                <w:b w:val="0"/>
+                <w:sz w:val="19"/>
+              </w:rPr>
+              <w:t>Shift-left defects</w:t>
+            </w:r>
+          </w:p>
+        </w:tc>
+        <w:tc>
+          <w:tcPr>
+            <w:tcW w:type="dxa" w:w="4464"/>
+          </w:tcPr>
+          <w:p>
+            <w:r/>
+            <w:r>
+              <w:rPr>
+                <w:b w:val="0"/>
+                <w:sz w:val="19"/>
+              </w:rPr>
+              <w:t>Contract defects cost ~10× less in design than UAT (60 × £2,700)</w:t>
+            </w:r>
+          </w:p>
+        </w:tc>
+        <w:tc>
+          <w:tcPr>
+            <w:tcW w:type="dxa" w:w="1584"/>
+          </w:tcPr>
+          <w:p>
+            <w:r/>
+            <w:r>
+              <w:rPr>
+                <w:b w:val="0"/>
+                <w:sz w:val="19"/>
+              </w:rPr>
+              <w:t>~£162k</w:t>
+            </w:r>
+          </w:p>
+        </w:tc>
+      </w:tr>
+      <w:tr>
+        <w:tc>
+          <w:tcPr>
+            <w:tcW w:type="dxa" w:w="2736"/>
+          </w:tcPr>
+          <w:p>
+            <w:r/>
+            <w:r>
+              <w:rPr>
+                <w:b w:val="0"/>
+                <w:sz w:val="19"/>
+              </w:rPr>
+              <w:t>Schedule compression</w:t>
+            </w:r>
+          </w:p>
+        </w:tc>
+        <w:tc>
+          <w:tcPr>
+            <w:tcW w:type="dxa" w:w="4464"/>
+          </w:tcPr>
+          <w:p>
+            <w:r/>
+            <w:r>
+              <w:rPr>
+                <w:b w:val="0"/>
+                <w:sz w:val="19"/>
+              </w:rPr>
+              <w:t>Integration testing starts before vendor environments are ready</w:t>
+            </w:r>
+          </w:p>
+        </w:tc>
+        <w:tc>
+          <w:tcPr>
+            <w:tcW w:type="dxa" w:w="1584"/>
+          </w:tcPr>
+          <w:p>
+            <w:r/>
+            <w:r>
+              <w:rPr>
+                <w:b w:val="0"/>
+                <w:sz w:val="19"/>
+              </w:rPr>
+              <w:t>~£40k</w:t>
+            </w:r>
+          </w:p>
+        </w:tc>
+      </w:tr>
+      <w:tr>
+        <w:tc>
+          <w:tcPr>
+            <w:tcW w:type="dxa" w:w="2736"/>
+          </w:tcPr>
+          <w:p>
+            <w:r/>
+            <w:r>
+              <w:rPr>
+                <w:b w:val="0"/>
+                <w:sz w:val="19"/>
+              </w:rPr>
+              <w:t>Reusability</w:t>
+            </w:r>
+          </w:p>
+        </w:tc>
+        <w:tc>
+          <w:tcPr>
+            <w:tcW w:type="dxa" w:w="4464"/>
+          </w:tcPr>
+          <w:p>
+            <w:r/>
+            <w:r>
+              <w:rPr>
+                <w:b w:val="0"/>
+                <w:sz w:val="19"/>
+              </w:rPr>
+              <w:t>Mocks and contracts reused for regression and future upgrades</w:t>
+            </w:r>
+          </w:p>
+        </w:tc>
+        <w:tc>
+          <w:tcPr>
+            <w:tcW w:type="dxa" w:w="1584"/>
+          </w:tcPr>
+          <w:p>
+            <w:r/>
+            <w:r>
+              <w:rPr>
+                <w:b w:val="0"/>
+                <w:sz w:val="19"/>
+              </w:rPr>
+              <w:t>recurring</w:t>
+            </w:r>
+          </w:p>
+        </w:tc>
+      </w:tr>
+    </w:tbl>
+    <w:p/>
+    <w:p>
+      <w:r>
+        <w:rPr>
+          <w:b/>
+          <w:color w:val="1F2328"/>
+          <w:sz w:val="23"/>
+        </w:rPr>
+        <w:t>3. Data Migration Assist</w:t>
+      </w:r>
+    </w:p>
+    <w:tbl>
+      <w:tblPr>
+        <w:tblW w:type="auto" w:w="0"/>
+        <w:tblLook w:firstColumn="1" w:firstRow="1" w:lastColumn="0" w:lastRow="0" w:noHBand="0" w:noVBand="1" w:val="04A0"/>
+        <w:tblBorders>
+          <w:top w:val="single" w:sz="4" w:color="D0D7DE"/>
+          <w:left w:val="single" w:sz="4" w:color="D0D7DE"/>
+          <w:bottom w:val="single" w:sz="4" w:color="D0D7DE"/>
+          <w:right w:val="single" w:sz="4" w:color="D0D7DE"/>
+          <w:insideH w:val="single" w:sz="4" w:color="D0D7DE"/>
+          <w:insideV w:val="single" w:sz="4" w:color="D0D7DE"/>
+        </w:tblBorders>
+      </w:tblPr>
+      <w:tblGrid>
+        <w:gridCol w:w="2880"/>
+        <w:gridCol w:w="2880"/>
+        <w:gridCol w:w="2880"/>
+      </w:tblGrid>
+      <w:tr>
+        <w:tc>
+          <w:tcPr>
+            <w:tcW w:type="dxa" w:w="2736"/>
+            <w:shd w:val="clear" w:fill="1F2328"/>
+          </w:tcPr>
+          <w:p>
+            <w:r/>
+            <w:r>
+              <w:rPr>
+                <w:b/>
+                <w:color w:val="FFFFFF"/>
+                <w:sz w:val="19"/>
+              </w:rPr>
+              <w:t>Value lever</w:t>
+            </w:r>
+          </w:p>
+        </w:tc>
+        <w:tc>
+          <w:tcPr>
+            <w:tcW w:type="dxa" w:w="4464"/>
+            <w:shd w:val="clear" w:fill="1F2328"/>
+          </w:tcPr>
+          <w:p>
+            <w:r/>
+            <w:r>
+              <w:rPr>
+                <w:b/>
+                <w:color w:val="FFFFFF"/>
+                <w:sz w:val="19"/>
+              </w:rPr>
+              <w:t>Basis</w:t>
+            </w:r>
+          </w:p>
+        </w:tc>
+        <w:tc>
+          <w:tcPr>
+            <w:tcW w:type="dxa" w:w="1584"/>
+            <w:shd w:val="clear" w:fill="1F2328"/>
+          </w:tcPr>
+          <w:p>
+            <w:r/>
+            <w:r>
+              <w:rPr>
+                <w:b/>
+                <w:color w:val="FFFFFF"/>
+                <w:sz w:val="19"/>
+              </w:rPr>
+              <w:t>Illustrative</w:t>
+            </w:r>
+          </w:p>
+        </w:tc>
+      </w:tr>
+      <w:tr>
+        <w:tc>
+          <w:tcPr>
+            <w:tcW w:type="dxa" w:w="2736"/>
+          </w:tcPr>
+          <w:p>
+            <w:r/>
+            <w:r>
+              <w:rPr>
+                <w:b w:val="0"/>
+                <w:sz w:val="19"/>
+              </w:rPr>
+              <w:t>Fewer failed dry-runs</w:t>
+            </w:r>
+          </w:p>
+        </w:tc>
+        <w:tc>
+          <w:tcPr>
+            <w:tcW w:type="dxa" w:w="4464"/>
+          </w:tcPr>
+          <w:p>
+            <w:r/>
+            <w:r>
+              <w:rPr>
+                <w:b w:val="0"/>
+                <w:sz w:val="19"/>
+              </w:rPr>
+              <w:t>Early validation avoids ~2 reconciliation dry-runs (£40k each)</w:t>
+            </w:r>
+          </w:p>
+        </w:tc>
+        <w:tc>
+          <w:tcPr>
+            <w:tcW w:type="dxa" w:w="1584"/>
+          </w:tcPr>
+          <w:p>
+            <w:r/>
+            <w:r>
+              <w:rPr>
+                <w:b w:val="0"/>
+                <w:sz w:val="19"/>
+              </w:rPr>
+              <w:t>~£80k</w:t>
+            </w:r>
+          </w:p>
+        </w:tc>
+      </w:tr>
+      <w:tr>
+        <w:tc>
+          <w:tcPr>
+            <w:tcW w:type="dxa" w:w="2736"/>
+          </w:tcPr>
+          <w:p>
+            <w:r/>
+            <w:r>
+              <w:rPr>
+                <w:b w:val="0"/>
+                <w:sz w:val="19"/>
+              </w:rPr>
+              <w:t>Go-live defect avoidance</w:t>
+            </w:r>
+          </w:p>
+        </w:tc>
+        <w:tc>
+          <w:tcPr>
+            <w:tcW w:type="dxa" w:w="4464"/>
+          </w:tcPr>
+          <w:p>
+            <w:r/>
+            <w:r>
+              <w:rPr>
+                <w:b w:val="0"/>
+                <w:sz w:val="19"/>
+              </w:rPr>
+              <w:t>Avoided policy/claim/billing remediation and regulatory risk</w:t>
+            </w:r>
+          </w:p>
+        </w:tc>
+        <w:tc>
+          <w:tcPr>
+            <w:tcW w:type="dxa" w:w="1584"/>
+          </w:tcPr>
+          <w:p>
+            <w:r/>
+            <w:r>
+              <w:rPr>
+                <w:b w:val="0"/>
+                <w:sz w:val="19"/>
+              </w:rPr>
+              <w:t>~£50k</w:t>
+            </w:r>
+          </w:p>
+        </w:tc>
+      </w:tr>
+      <w:tr>
+        <w:tc>
+          <w:tcPr>
+            <w:tcW w:type="dxa" w:w="2736"/>
+          </w:tcPr>
+          <w:p>
+            <w:r/>
+            <w:r>
+              <w:rPr>
+                <w:b w:val="0"/>
+                <w:sz w:val="19"/>
+              </w:rPr>
+              <w:t>Automated profiling</w:t>
+            </w:r>
+          </w:p>
+        </w:tc>
+        <w:tc>
+          <w:tcPr>
+            <w:tcW w:type="dxa" w:w="4464"/>
+          </w:tcPr>
+          <w:p>
+            <w:r/>
+            <w:r>
+              <w:rPr>
+                <w:b w:val="0"/>
+                <w:sz w:val="19"/>
+              </w:rPr>
+              <w:t>Replaces ~20 analyst-days of manual SQL per cycle</w:t>
+            </w:r>
+          </w:p>
+        </w:tc>
+        <w:tc>
+          <w:tcPr>
+            <w:tcW w:type="dxa" w:w="1584"/>
+          </w:tcPr>
+          <w:p>
+            <w:r/>
+            <w:r>
+              <w:rPr>
+                <w:b w:val="0"/>
+                <w:sz w:val="19"/>
+              </w:rPr>
+              <w:t>~£14k</w:t>
+            </w:r>
+          </w:p>
+        </w:tc>
+      </w:tr>
+    </w:tbl>
+    <w:p/>
+    <w:p>
+      <w:pPr>
+        <w:pStyle w:val="Heading2"/>
+      </w:pPr>
+      <w:r>
+        <w:rPr>
+          <w:color w:val="1F2328"/>
+        </w:rPr>
+        <w:t>Consolidated business case (per programme)</w:t>
+      </w:r>
+    </w:p>
+    <w:tbl>
+      <w:tblPr>
+        <w:tblW w:type="auto" w:w="0"/>
+        <w:tblLook w:firstColumn="1" w:firstRow="1" w:lastColumn="0" w:lastRow="0" w:noHBand="0" w:noVBand="1" w:val="04A0"/>
+        <w:tblBorders>
+          <w:top w:val="single" w:sz="4" w:color="D0D7DE"/>
+          <w:left w:val="single" w:sz="4" w:color="D0D7DE"/>
+          <w:bottom w:val="single" w:sz="4" w:color="D0D7DE"/>
+          <w:right w:val="single" w:sz="4" w:color="D0D7DE"/>
+          <w:insideH w:val="single" w:sz="4" w:color="D0D7DE"/>
+          <w:insideV w:val="single" w:sz="4" w:color="D0D7DE"/>
+        </w:tblBorders>
+      </w:tblPr>
+      <w:tblGrid>
+        <w:gridCol w:w="2160"/>
+        <w:gridCol w:w="2160"/>
+        <w:gridCol w:w="2160"/>
+        <w:gridCol w:w="2160"/>
+      </w:tblGrid>
+      <w:tr>
+        <w:tc>
+          <w:tcPr>
+            <w:tcW w:type="dxa" w:w="4176"/>
+            <w:shd w:val="clear" w:fill="1F2328"/>
+          </w:tcPr>
+          <w:p>
+            <w:r/>
+            <w:r>
+              <w:rPr>
+                <w:b/>
+                <w:color w:val="FFFFFF"/>
+                <w:sz w:val="19"/>
+              </w:rPr>
+              <w:t>Line</w:t>
+            </w:r>
+          </w:p>
+        </w:tc>
+        <w:tc>
+          <w:tcPr>
+            <w:tcW w:type="dxa" w:w="1728"/>
+            <w:shd w:val="clear" w:fill="1F2328"/>
+          </w:tcPr>
+          <w:p>
+            <w:r/>
+            <w:r>
+              <w:rPr>
+                <w:b/>
+                <w:color w:val="FFFFFF"/>
+                <w:sz w:val="19"/>
+              </w:rPr>
+              <w:t>Conservative</w:t>
+            </w:r>
+          </w:p>
+        </w:tc>
+        <w:tc>
+          <w:tcPr>
+            <w:tcW w:type="dxa" w:w="1584"/>
+            <w:shd w:val="clear" w:fill="1F2328"/>
+          </w:tcPr>
+          <w:p>
+            <w:r/>
+            <w:r>
+              <w:rPr>
+                <w:b/>
+                <w:color w:val="FFFFFF"/>
+                <w:sz w:val="19"/>
+              </w:rPr>
+              <w:t>Base</w:t>
+            </w:r>
+          </w:p>
+        </w:tc>
+        <w:tc>
+          <w:tcPr>
+            <w:tcW w:type="dxa" w:w="1728"/>
+            <w:shd w:val="clear" w:fill="1F2328"/>
+          </w:tcPr>
+          <w:p>
+            <w:r/>
+            <w:r>
+              <w:rPr>
+                <w:b/>
+                <w:color w:val="FFFFFF"/>
+                <w:sz w:val="19"/>
+              </w:rPr>
+              <w:t>Optimistic</w:t>
+            </w:r>
+          </w:p>
+        </w:tc>
+      </w:tr>
+      <w:tr>
+        <w:tc>
+          <w:tcPr>
+            <w:tcW w:type="dxa" w:w="4176"/>
+          </w:tcPr>
+          <w:p>
+            <w:r/>
+            <w:r>
+              <w:rPr>
+                <w:b w:val="0"/>
+                <w:sz w:val="19"/>
+              </w:rPr>
+              <w:t>Upgrade readiness scoring</w:t>
+            </w:r>
+          </w:p>
+        </w:tc>
+        <w:tc>
+          <w:tcPr>
+            <w:tcW w:type="dxa" w:w="1728"/>
+          </w:tcPr>
+          <w:p>
+            <w:r/>
+            <w:r>
+              <w:rPr>
+                <w:b w:val="0"/>
+                <w:sz w:val="19"/>
+              </w:rPr>
+              <w:t>£60k</w:t>
+            </w:r>
+          </w:p>
+        </w:tc>
+        <w:tc>
+          <w:tcPr>
+            <w:tcW w:type="dxa" w:w="1584"/>
+          </w:tcPr>
+          <w:p>
+            <w:r/>
+            <w:r>
+              <w:rPr>
+                <w:b w:val="0"/>
+                <w:sz w:val="19"/>
+              </w:rPr>
+              <w:t>£95k</w:t>
+            </w:r>
+          </w:p>
+        </w:tc>
+        <w:tc>
+          <w:tcPr>
+            <w:tcW w:type="dxa" w:w="1728"/>
+          </w:tcPr>
+          <w:p>
+            <w:r/>
+            <w:r>
+              <w:rPr>
+                <w:b w:val="0"/>
+                <w:sz w:val="19"/>
+              </w:rPr>
+              <w:t>£140k</w:t>
+            </w:r>
+          </w:p>
+        </w:tc>
+      </w:tr>
+      <w:tr>
+        <w:tc>
+          <w:tcPr>
+            <w:tcW w:type="dxa" w:w="4176"/>
+          </w:tcPr>
+          <w:p>
+            <w:r/>
+            <w:r>
+              <w:rPr>
+                <w:b w:val="0"/>
+                <w:sz w:val="19"/>
+              </w:rPr>
+              <w:t>Vendor mocks &amp; contract tests</w:t>
+            </w:r>
+          </w:p>
+        </w:tc>
+        <w:tc>
+          <w:tcPr>
+            <w:tcW w:type="dxa" w:w="1728"/>
+          </w:tcPr>
+          <w:p>
+            <w:r/>
+            <w:r>
+              <w:rPr>
+                <w:b w:val="0"/>
+                <w:sz w:val="19"/>
+              </w:rPr>
+              <w:t>£110k</w:t>
+            </w:r>
+          </w:p>
+        </w:tc>
+        <w:tc>
+          <w:tcPr>
+            <w:tcW w:type="dxa" w:w="1584"/>
+          </w:tcPr>
+          <w:p>
+            <w:r/>
+            <w:r>
+              <w:rPr>
+                <w:b w:val="0"/>
+                <w:sz w:val="19"/>
+              </w:rPr>
+              <w:t>£200k</w:t>
+            </w:r>
+          </w:p>
+        </w:tc>
+        <w:tc>
+          <w:tcPr>
+            <w:tcW w:type="dxa" w:w="1728"/>
+          </w:tcPr>
+          <w:p>
+            <w:r/>
+            <w:r>
+              <w:rPr>
+                <w:b w:val="0"/>
+                <w:sz w:val="19"/>
+              </w:rPr>
+              <w:t>£320k</w:t>
+            </w:r>
+          </w:p>
+        </w:tc>
+      </w:tr>
+      <w:tr>
+        <w:tc>
+          <w:tcPr>
+            <w:tcW w:type="dxa" w:w="4176"/>
+          </w:tcPr>
+          <w:p>
+            <w:r/>
+            <w:r>
+              <w:rPr>
+                <w:b w:val="0"/>
+                <w:sz w:val="19"/>
+              </w:rPr>
+              <w:t>Data migration assist</w:t>
+            </w:r>
+          </w:p>
+        </w:tc>
+        <w:tc>
+          <w:tcPr>
+            <w:tcW w:type="dxa" w:w="1728"/>
+          </w:tcPr>
+          <w:p>
+            <w:r/>
+            <w:r>
+              <w:rPr>
+                <w:b w:val="0"/>
+                <w:sz w:val="19"/>
+              </w:rPr>
+              <w:t>£90k</w:t>
+            </w:r>
+          </w:p>
+        </w:tc>
+        <w:tc>
+          <w:tcPr>
+            <w:tcW w:type="dxa" w:w="1584"/>
+          </w:tcPr>
+          <w:p>
+            <w:r/>
+            <w:r>
+              <w:rPr>
+                <w:b w:val="0"/>
+                <w:sz w:val="19"/>
+              </w:rPr>
+              <w:t>£150k</w:t>
+            </w:r>
+          </w:p>
+        </w:tc>
+        <w:tc>
+          <w:tcPr>
+            <w:tcW w:type="dxa" w:w="1728"/>
+          </w:tcPr>
+          <w:p>
+            <w:r/>
+            <w:r>
+              <w:rPr>
+                <w:b w:val="0"/>
+                <w:sz w:val="19"/>
+              </w:rPr>
+              <w:t>£230k</w:t>
+            </w:r>
+          </w:p>
+        </w:tc>
+      </w:tr>
+      <w:tr>
+        <w:tc>
+          <w:tcPr>
+            <w:tcW w:type="dxa" w:w="4176"/>
+            <w:shd w:val="clear" w:fill="F6F8FA"/>
+          </w:tcPr>
+          <w:p>
+            <w:r/>
+            <w:r>
+              <w:rPr>
+                <w:b/>
+                <w:sz w:val="19"/>
+              </w:rPr>
+              <w:t>Total gross benefit / programme</w:t>
+            </w:r>
+          </w:p>
+        </w:tc>
+        <w:tc>
+          <w:tcPr>
+            <w:tcW w:type="dxa" w:w="1728"/>
+            <w:shd w:val="clear" w:fill="F6F8FA"/>
+          </w:tcPr>
+          <w:p>
+            <w:r/>
+            <w:r>
+              <w:rPr>
+                <w:b/>
+                <w:sz w:val="19"/>
+              </w:rPr>
+              <w:t>£260k</w:t>
+            </w:r>
+          </w:p>
+        </w:tc>
+        <w:tc>
+          <w:tcPr>
+            <w:tcW w:type="dxa" w:w="1584"/>
+            <w:shd w:val="clear" w:fill="F6F8FA"/>
+          </w:tcPr>
+          <w:p>
+            <w:r/>
+            <w:r>
+              <w:rPr>
+                <w:b/>
+                <w:sz w:val="19"/>
+              </w:rPr>
+              <w:t>£445k</w:t>
+            </w:r>
+          </w:p>
+        </w:tc>
+        <w:tc>
+          <w:tcPr>
+            <w:tcW w:type="dxa" w:w="1728"/>
+            <w:shd w:val="clear" w:fill="F6F8FA"/>
+          </w:tcPr>
+          <w:p>
+            <w:r/>
+            <w:r>
+              <w:rPr>
+                <w:b/>
+                <w:sz w:val="19"/>
+              </w:rPr>
+              <w:t>£690k</w:t>
+            </w:r>
+          </w:p>
+        </w:tc>
+      </w:tr>
+      <w:tr>
+        <w:tc>
+          <w:tcPr>
+            <w:tcW w:type="dxa" w:w="4176"/>
+          </w:tcPr>
+          <w:p>
+            <w:r/>
+            <w:r>
+              <w:rPr>
+                <w:b w:val="0"/>
+                <w:sz w:val="19"/>
+              </w:rPr>
+              <w:t>Investment (year 1: £120k build + £20k run)</w:t>
+            </w:r>
+          </w:p>
+        </w:tc>
+        <w:tc>
+          <w:tcPr>
+            <w:tcW w:type="dxa" w:w="1728"/>
+          </w:tcPr>
+          <w:p>
+            <w:r/>
+            <w:r>
+              <w:rPr>
+                <w:b w:val="0"/>
+                <w:sz w:val="19"/>
+              </w:rPr>
+              <w:t>£140k</w:t>
+            </w:r>
+          </w:p>
+        </w:tc>
+        <w:tc>
+          <w:tcPr>
+            <w:tcW w:type="dxa" w:w="1584"/>
+          </w:tcPr>
+          <w:p>
+            <w:r/>
+            <w:r>
+              <w:rPr>
+                <w:b w:val="0"/>
+                <w:sz w:val="19"/>
+              </w:rPr>
+              <w:t>£140k</w:t>
+            </w:r>
+          </w:p>
+        </w:tc>
+        <w:tc>
+          <w:tcPr>
+            <w:tcW w:type="dxa" w:w="1728"/>
+          </w:tcPr>
+          <w:p>
+            <w:r/>
+            <w:r>
+              <w:rPr>
+                <w:b w:val="0"/>
+                <w:sz w:val="19"/>
+              </w:rPr>
+              <w:t>£140k</w:t>
+            </w:r>
+          </w:p>
+        </w:tc>
+      </w:tr>
+      <w:tr>
+        <w:tc>
+          <w:tcPr>
+            <w:tcW w:type="dxa" w:w="4176"/>
+            <w:shd w:val="clear" w:fill="F6F8FA"/>
+          </w:tcPr>
+          <w:p>
+            <w:r/>
+            <w:r>
+              <w:rPr>
+                <w:b/>
+                <w:sz w:val="19"/>
+              </w:rPr>
+              <w:t>Net benefit (year 1)</w:t>
+            </w:r>
+          </w:p>
+        </w:tc>
+        <w:tc>
+          <w:tcPr>
+            <w:tcW w:type="dxa" w:w="1728"/>
+            <w:shd w:val="clear" w:fill="F6F8FA"/>
+          </w:tcPr>
+          <w:p>
+            <w:r/>
+            <w:r>
+              <w:rPr>
+                <w:b/>
+                <w:sz w:val="19"/>
+              </w:rPr>
+              <w:t>£120k</w:t>
+            </w:r>
+          </w:p>
+        </w:tc>
+        <w:tc>
+          <w:tcPr>
+            <w:tcW w:type="dxa" w:w="1584"/>
+            <w:shd w:val="clear" w:fill="F6F8FA"/>
+          </w:tcPr>
+          <w:p>
+            <w:r/>
+            <w:r>
+              <w:rPr>
+                <w:b/>
+                <w:sz w:val="19"/>
+              </w:rPr>
+              <w:t>£305k</w:t>
+            </w:r>
+          </w:p>
+        </w:tc>
+        <w:tc>
+          <w:tcPr>
+            <w:tcW w:type="dxa" w:w="1728"/>
+            <w:shd w:val="clear" w:fill="F6F8FA"/>
+          </w:tcPr>
+          <w:p>
+            <w:r/>
+            <w:r>
+              <w:rPr>
+                <w:b/>
+                <w:sz w:val="19"/>
+              </w:rPr>
+              <w:t>£550k</w:t>
+            </w:r>
+          </w:p>
+        </w:tc>
+      </w:tr>
+      <w:tr>
+        <w:tc>
+          <w:tcPr>
+            <w:tcW w:type="dxa" w:w="4176"/>
+            <w:shd w:val="clear" w:fill="F6F8FA"/>
+          </w:tcPr>
+          <w:p>
+            <w:r/>
+            <w:r>
+              <w:rPr>
+                <w:b/>
+                <w:sz w:val="19"/>
+              </w:rPr>
+              <w:t>ROI (year 1)</w:t>
+            </w:r>
+          </w:p>
+        </w:tc>
+        <w:tc>
+          <w:tcPr>
+            <w:tcW w:type="dxa" w:w="1728"/>
+            <w:shd w:val="clear" w:fill="F6F8FA"/>
+          </w:tcPr>
+          <w:p>
+            <w:r/>
+            <w:r>
+              <w:rPr>
+                <w:b/>
+                <w:sz w:val="19"/>
+              </w:rPr>
+              <w:t>86%</w:t>
+            </w:r>
+          </w:p>
+        </w:tc>
+        <w:tc>
+          <w:tcPr>
+            <w:tcW w:type="dxa" w:w="1584"/>
+            <w:shd w:val="clear" w:fill="F6F8FA"/>
+          </w:tcPr>
+          <w:p>
+            <w:r/>
+            <w:r>
+              <w:rPr>
+                <w:b/>
+                <w:sz w:val="19"/>
+              </w:rPr>
+              <w:t>218%</w:t>
+            </w:r>
+          </w:p>
+        </w:tc>
+        <w:tc>
+          <w:tcPr>
+            <w:tcW w:type="dxa" w:w="1728"/>
+            <w:shd w:val="clear" w:fill="F6F8FA"/>
+          </w:tcPr>
+          <w:p>
+            <w:r/>
+            <w:r>
+              <w:rPr>
+                <w:b/>
+                <w:sz w:val="19"/>
+              </w:rPr>
+              <w:t>393%</w:t>
+            </w:r>
+          </w:p>
+        </w:tc>
+      </w:tr>
+      <w:tr>
+        <w:tc>
+          <w:tcPr>
+            <w:tcW w:type="dxa" w:w="4176"/>
+            <w:shd w:val="clear" w:fill="F6F8FA"/>
+          </w:tcPr>
+          <w:p>
+            <w:r/>
+            <w:r>
+              <w:rPr>
+                <w:b/>
+                <w:sz w:val="19"/>
+              </w:rPr>
+              <w:t>Payback period</w:t>
+            </w:r>
+          </w:p>
+        </w:tc>
+        <w:tc>
+          <w:tcPr>
+            <w:tcW w:type="dxa" w:w="1728"/>
+            <w:shd w:val="clear" w:fill="F6F8FA"/>
+          </w:tcPr>
+          <w:p>
+            <w:r/>
+            <w:r>
+              <w:rPr>
+                <w:b/>
+                <w:sz w:val="19"/>
+              </w:rPr>
+              <w:t>~7 months</w:t>
+            </w:r>
+          </w:p>
+        </w:tc>
+        <w:tc>
+          <w:tcPr>
+            <w:tcW w:type="dxa" w:w="1584"/>
+            <w:shd w:val="clear" w:fill="F6F8FA"/>
+          </w:tcPr>
+          <w:p>
+            <w:r/>
+            <w:r>
+              <w:rPr>
+                <w:b/>
+                <w:sz w:val="19"/>
+              </w:rPr>
+              <w:t>~4 months</w:t>
+            </w:r>
+          </w:p>
+        </w:tc>
+        <w:tc>
+          <w:tcPr>
+            <w:tcW w:type="dxa" w:w="1728"/>
+            <w:shd w:val="clear" w:fill="F6F8FA"/>
+          </w:tcPr>
+          <w:p>
+            <w:r/>
+            <w:r>
+              <w:rPr>
+                <w:b/>
+                <w:sz w:val="19"/>
+              </w:rPr>
+              <w:t>~2.5 months</w:t>
+            </w:r>
+          </w:p>
+        </w:tc>
+      </w:tr>
+    </w:tbl>
+    <w:p/>
+    <w:p>
+      <w:pPr>
+        <w:pStyle w:val="Heading2"/>
+      </w:pPr>
+      <w:r>
+        <w:rPr>
+          <w:color w:val="1F2328"/>
+        </w:rPr>
+        <w:t>Key assumptions</w:t>
+      </w:r>
+    </w:p>
+    <w:p>
+      <w:pPr>
+        <w:pStyle w:val="ListBullet"/>
+        <w:spacing w:after="40"/>
+      </w:pPr>
+      <w:r>
+        <w:t>Blended day rate £700; programme ~£2M over 6–12 months; ~20 integrations.</w:t>
+      </w:r>
+    </w:p>
+    <w:p>
+      <w:pPr>
+        <w:pStyle w:val="ListBullet"/>
+        <w:spacing w:after="40"/>
+      </w:pPr>
+      <w:r>
+        <w:t>Defect remediation ~£300 in design vs ~£3,000 in UAT (~10× phase multiplier).</w:t>
+      </w:r>
+    </w:p>
+    <w:p>
+      <w:pPr>
+        <w:pStyle w:val="ListBullet"/>
+        <w:spacing w:after="40"/>
+      </w:pPr>
+      <w:r>
+        <w:t>Investment: £120k one-off productionisation + £20k/year to run.</w:t>
+      </w:r>
+    </w:p>
+    <w:p>
+      <w:pPr>
+        <w:pStyle w:val="ListBullet"/>
+        <w:spacing w:after="40"/>
+      </w:pPr>
+      <w:r>
+        <w:t>Cadence: 1–2 upgrade programmes/year. Accelerators are reusable assets — year 2+ carries only the ~£20k run cost, so ROI rises sharply.</w:t>
+      </w:r>
+    </w:p>
+    <w:p>
+      <w:pPr>
+        <w:pStyle w:val="ListBullet"/>
+        <w:spacing w:after="40"/>
+      </w:pPr>
+      <w:r>
+        <w:t>All figures are illustrative; replace with client baselines. The app already captures many of the required inputs (integration inventory, coverage %, data quality, customisation footprint).</w:t>
+      </w:r>
+    </w:p>
+    <w:p>
+      <w:pPr>
+        <w:pStyle w:val="Heading2"/>
+      </w:pPr>
+      <w:r>
+        <w:rPr>
+          <w:color w:val="1F2328"/>
+        </w:rPr>
+        <w:t>Sensitivity</w:t>
+      </w:r>
+    </w:p>
+    <w:p>
+      <w:pPr>
+        <w:pStyle w:val="ListBullet"/>
+        <w:spacing w:after="40"/>
+      </w:pPr>
+      <w:r>
+        <w:t>Most sensitive to: blended day rate, defect-leakage volume and the phase multiplier, and number of programmes per year.</w:t>
+      </w:r>
+    </w:p>
+    <w:p>
+      <w:pPr>
+        <w:pStyle w:val="ListBullet"/>
+        <w:spacing w:after="40"/>
+      </w:pPr>
+      <w:r>
+        <w:t>Reuse is the largest multiplier — each additional upgrade adds near-full benefit at close to zero marginal build cost.</w:t>
+      </w:r>
+    </w:p>
+    <w:p>
+      <w:pPr>
+        <w:pStyle w:val="ListBullet"/>
+        <w:spacing w:after="40"/>
+      </w:pPr>
+      <w:r>
+        <w:t>Even at the conservative case (86% year-1 ROI) the suite pays back inside two quarters.</w:t>
+      </w:r>
+    </w:p>
+    <w:p>
+      <w:pPr>
+        <w:pStyle w:val="Heading2"/>
+      </w:pPr>
+      <w:r>
+        <w:rPr>
+          <w:color w:val="1F2328"/>
+        </w:rPr>
+        <w:t>Evidencing realised ROI</w:t>
+      </w:r>
+    </w:p>
+    <w:p>
+      <w:pPr>
+        <w:spacing w:after="120"/>
+      </w:pPr>
+      <w:r>
+        <w:t>Track these leading indicators per area to prove the benefit is being realised:</w:t>
+      </w:r>
+    </w:p>
+    <w:tbl>
+      <w:tblPr>
+        <w:tblW w:type="auto" w:w="0"/>
+        <w:tblLook w:firstColumn="1" w:firstRow="1" w:lastColumn="0" w:lastRow="0" w:noHBand="0" w:noVBand="1" w:val="04A0"/>
+        <w:tblBorders>
+          <w:top w:val="single" w:sz="4" w:color="D0D7DE"/>
+          <w:left w:val="single" w:sz="4" w:color="D0D7DE"/>
+          <w:bottom w:val="single" w:sz="4" w:color="D0D7DE"/>
+          <w:right w:val="single" w:sz="4" w:color="D0D7DE"/>
+          <w:insideH w:val="single" w:sz="4" w:color="D0D7DE"/>
+          <w:insideV w:val="single" w:sz="4" w:color="D0D7DE"/>
+        </w:tblBorders>
+      </w:tblPr>
+      <w:tblGrid>
+        <w:gridCol w:w="4320"/>
+        <w:gridCol w:w="4320"/>
+      </w:tblGrid>
+      <w:tr>
+        <w:tc>
+          <w:tcPr>
+            <w:tcW w:type="dxa" w:w="3312"/>
+            <w:shd w:val="clear" w:fill="1F2328"/>
+          </w:tcPr>
+          <w:p>
+            <w:r/>
+            <w:r>
+              <w:rPr>
+                <w:b/>
+                <w:color w:val="FFFFFF"/>
+                <w:sz w:val="19"/>
+              </w:rPr>
+              <w:t>Accelerator</w:t>
+            </w:r>
+          </w:p>
+        </w:tc>
+        <w:tc>
+          <w:tcPr>
+            <w:tcW w:type="dxa" w:w="5616"/>
+            <w:shd w:val="clear" w:fill="1F2328"/>
+          </w:tcPr>
+          <w:p>
+            <w:r/>
+            <w:r>
+              <w:rPr>
+                <w:b/>
+                <w:color w:val="FFFFFF"/>
+                <w:sz w:val="19"/>
+              </w:rPr>
+              <w:t>Leading indicators</w:t>
+            </w:r>
+          </w:p>
+        </w:tc>
+      </w:tr>
+      <w:tr>
+        <w:tc>
+          <w:tcPr>
+            <w:tcW w:type="dxa" w:w="3312"/>
+          </w:tcPr>
+          <w:p>
+            <w:r/>
+            <w:r>
+              <w:rPr>
+                <w:b w:val="0"/>
+                <w:sz w:val="19"/>
+              </w:rPr>
+              <w:t>Upgrade Readiness Scoring</w:t>
+            </w:r>
+          </w:p>
+        </w:tc>
+        <w:tc>
+          <w:tcPr>
+            <w:tcW w:type="dxa" w:w="5616"/>
+          </w:tcPr>
+          <w:p>
+            <w:r/>
+            <w:r>
+              <w:rPr>
+                <w:b w:val="0"/>
+                <w:sz w:val="19"/>
+              </w:rPr>
+              <w:t>Assessment cycle time; blockers found pre-build vs in-build; estimate accuracy; overrun %.</w:t>
+            </w:r>
+          </w:p>
+        </w:tc>
+      </w:tr>
+      <w:tr>
+        <w:tc>
+          <w:tcPr>
+            <w:tcW w:type="dxa" w:w="3312"/>
+          </w:tcPr>
+          <w:p>
+            <w:r/>
+            <w:r>
+              <w:rPr>
+                <w:b w:val="0"/>
+                <w:sz w:val="19"/>
+              </w:rPr>
+              <w:t>Vendor Mocks &amp; Contract Tests</w:t>
+            </w:r>
+          </w:p>
+        </w:tc>
+        <w:tc>
+          <w:tcPr>
+            <w:tcW w:type="dxa" w:w="5616"/>
+          </w:tcPr>
+          <w:p>
+            <w:r/>
+            <w:r>
+              <w:rPr>
+                <w:b w:val="0"/>
+                <w:sz w:val="19"/>
+              </w:rPr>
+              <w:t>Defect escape rate by phase; integration test start vs vendor readiness; blocked test-days avoided; contract coverage %.</w:t>
+            </w:r>
+          </w:p>
+        </w:tc>
+      </w:tr>
+      <w:tr>
+        <w:tc>
+          <w:tcPr>
+            <w:tcW w:type="dxa" w:w="3312"/>
+          </w:tcPr>
+          <w:p>
+            <w:r/>
+            <w:r>
+              <w:rPr>
+                <w:b w:val="0"/>
+                <w:sz w:val="19"/>
+              </w:rPr>
+              <w:t>Data Migration Assist</w:t>
+            </w:r>
+          </w:p>
+        </w:tc>
+        <w:tc>
+          <w:tcPr>
+            <w:tcW w:type="dxa" w:w="5616"/>
+          </w:tcPr>
+          <w:p>
+            <w:r/>
+            <w:r>
+              <w:rPr>
+                <w:b w:val="0"/>
+                <w:sz w:val="19"/>
+              </w:rPr>
+              <w:t>Dry-run count; first-time reconciliation pass rate; defects per 10k records; post-go-live data incidents.</w:t>
+            </w:r>
+          </w:p>
+        </w:tc>
+      </w:tr>
+    </w:tbl>
+    <w:p/>
+    <w:p>
+      <w:r>
+        <w:rPr>
+          <w:i/>
+          <w:color w:val="656D76"/>
+          <w:sz w:val="18"/>
+        </w:rPr>
+        <w:t>Figures are illustrative and should be replaced with client baselines before use in a funding decision.</w:t>
+      </w:r>
+    </w:p>
+    <w:p>
+      <w:r>
+        <w:br w:type="page"/>
+      </w:r>
+    </w:p>
+    <w:p>
       <w:pPr>
         <w:pStyle w:val="Heading1"/>
       </w:pPr>

</xml_diff>